<commit_message>
Match CV section headings to assessment brief
Co-Authored-By: Claude Sonnet 5.5 <noreply@anthropic.com>
Claude-Session: https://claude.ai/code/session_018Dx26T8Zu1UEK76AGEjy4W
</commit_message>
<xml_diff>
--- a/cv/Ankita_Gurung_CV_and_Cover_Letter_Creative.docx
+++ b/cv/Ankita_Gurung_CV_and_Cover_Letter_Creative.docx
@@ -58,7 +58,7 @@
                 <w:sz w:val="21"/>
                 <w:szCs w:val="21"/>
               </w:rPr>
-              <w:t xml:space="preserve">CONTACT</w:t>
+              <w:t xml:space="preserve">CONTACT DETAILS</w:t>
             </w:r>
           </w:p>
           <w:p>
@@ -203,7 +203,7 @@
                 <w:sz w:val="21"/>
                 <w:szCs w:val="21"/>
               </w:rPr>
-              <w:t xml:space="preserve">KEY SKILLS</w:t>
+              <w:t xml:space="preserve">SKILLS</w:t>
             </w:r>
           </w:p>
           <w:p>
@@ -561,45 +561,6 @@
                 <w:szCs w:val="19"/>
               </w:rPr>
               <w:t xml:space="preserve">Microsoft Word, PowerPoint, Excel, email and general computer skills</w:t>
-            </w:r>
-          </w:p>
-          <w:p>
-            <w:pPr>
-              <w:spacing w:after="50" w:before="260"/>
-            </w:pPr>
-            <w:r>
-              <w:rPr>
-                <w:rFonts w:ascii="Calibri" w:cs="Calibri" w:eastAsia="Calibri" w:hAnsi="Calibri"/>
-                <w:b/>
-                <w:bCs/>
-                <w:color w:val="E3A63B"/>
-                <w:spacing w:val="40"/>
-                <w:sz w:val="21"/>
-                <w:szCs w:val="21"/>
-              </w:rPr>
-              <w:t xml:space="preserve">INTERESTS</w:t>
-            </w:r>
-          </w:p>
-          <w:p>
-            <w:pPr>
-              <w:pBdr>
-                <w:bottom w:val="single" w:color="E3A63B" w:sz="6" w:space="1"/>
-              </w:pBdr>
-              <w:spacing w:after="100"/>
-            </w:pPr>
-          </w:p>
-          <w:p>
-            <w:pPr>
-              <w:spacing w:after="60"/>
-            </w:pPr>
-            <w:r>
-              <w:rPr>
-                <w:rFonts w:ascii="Calibri" w:cs="Calibri" w:eastAsia="Calibri" w:hAnsi="Calibri"/>
-                <w:color w:val="FFFFFF"/>
-                <w:sz w:val="19"/>
-                <w:szCs w:val="19"/>
-              </w:rPr>
-              <w:t xml:space="preserve">Travelling  ·  Playing games</w:t>
             </w:r>
           </w:p>
         </w:tc>
@@ -693,7 +654,7 @@
                 <w:sz w:val="25"/>
                 <w:szCs w:val="25"/>
               </w:rPr>
-              <w:t xml:space="preserve">PROFILE</w:t>
+              <w:t xml:space="preserve">PERSONAL PROFILE</w:t>
             </w:r>
           </w:p>
           <w:p>
@@ -878,7 +839,7 @@
                 <w:sz w:val="25"/>
                 <w:szCs w:val="25"/>
               </w:rPr>
-              <w:t xml:space="preserve">EDUCATION</w:t>
+              <w:t xml:space="preserve">EDUCATION &amp; QUALIFICATIONS</w:t>
             </w:r>
           </w:p>
           <w:p>
@@ -1021,7 +982,7 @@
                 <w:sz w:val="25"/>
                 <w:szCs w:val="25"/>
               </w:rPr>
-              <w:t xml:space="preserve">ACHIEVEMENTS</w:t>
+              <w:t xml:space="preserve">INTERESTS &amp; ACHIEVEMENTS</w:t>
             </w:r>
           </w:p>
           <w:p>
@@ -1060,6 +1021,25 @@
                 <w:szCs w:val="20"/>
               </w:rPr>
               <w:t xml:space="preserve">Moved from Nepal to the UK, adapting to a new culture and environment while progressing with my studies</w:t>
+            </w:r>
+          </w:p>
+          <w:p>
+            <w:pPr>
+              <w:pStyle w:val="ListParagraph"/>
+              <w:numPr>
+                <w:ilvl w:val="0"/>
+                <w:numId w:val="2"/>
+              </w:numPr>
+              <w:spacing w:after="45"/>
+            </w:pPr>
+            <w:r>
+              <w:rPr>
+                <w:rFonts w:ascii="Calibri" w:cs="Calibri" w:eastAsia="Calibri" w:hAnsi="Calibri"/>
+                <w:color w:val="26323A"/>
+                <w:sz w:val="20"/>
+                <w:szCs w:val="20"/>
+              </w:rPr>
+              <w:t xml:space="preserve">Interests: travelling and playing games</w:t>
             </w:r>
           </w:p>
           <w:p>

</xml_diff>